<commit_message>
Chuẩn hóa lề A4 theo NĐ 30/2020 và khối ký có dấu, chữ ký cân đối
Co-Authored-By: Claude Sonnet 5.5 <noreply@anthropic.com>
Claude-Session: https://claude.ai/code/session_01BDT3Nsast6YCNiawa4RUoc
</commit_message>
<xml_diff>
--- a/giay-to-khach-hang/FATA/DeNghiThanhToan_ConLai_HĐKT102026-TK-H.docx
+++ b/giay-to-khach-hang/FATA/DeNghiThanhToan_ConLai_HĐKT102026-TK-H.docx
@@ -178,21 +178,7 @@
           <w:b w:val="0"/>
           <w:i w:val="0"/>
         </w:rPr>
-        <w:t>Căn cứ Hợp đồng kinh tế số HĐKT102026-TK-H ký ngày 05/10/2026 giữa hai bên về việc cung cấp máy bơm nước AQUARIS (Italy) gồm 03 máy model CM65-160/15 và 04 máy model AQR65-200/15;</w:t>
-      </w:r>
-    </w:p>
-    <w:p>
-      <w:pPr>
-        <w:spacing w:after="60"/>
-        <w:jc w:val="both"/>
-      </w:pPr>
-      <w:r>
-        <w:rPr>
-          <w:rFonts w:ascii="Times New Roman" w:hAnsi="Times New Roman" w:eastAsia="Times New Roman"/>
-          <w:b w:val="0"/>
-          <w:i w:val="0"/>
-        </w:rPr>
-        <w:t>Căn cứ Phụ lục hợp đồng số 01/PLHĐ-HĐKT102026-TK-H ký ngày 12/10/2026 bổ sung 01 máy bơm model CM65-160/15 (sau bổ sung: 04 máy CM65-160/15 và 04 máy AQR65-200/15);</w:t>
+        <w:t>Căn cứ Hợp đồng kinh tế số HĐKT102026-TK-H ký ngày 05/10/2026 và Phụ lục hợp đồng số 01/PLHĐ-HĐKT102026-TK-H ký ngày 12/10/2026 về việc cung cấp máy bơm nước AQUARIS (Italy): 04 máy CM65-160/15 và 04 máy AQR65-200/15 (sau bổ sung);</w:t>
       </w:r>
     </w:p>
     <w:p>
@@ -301,11 +287,97 @@
             <w:r>
               <w:rPr>
                 <w:rFonts w:ascii="Times New Roman" w:hAnsi="Times New Roman" w:eastAsia="Times New Roman"/>
+                <w:b w:val="0"/>
+                <w:i w:val="0"/>
+                <w:sz w:val="24"/>
+              </w:rPr>
+              <w:t>Giá trị Hợp đồng gốc (đã gồm VAT 8%)</w:t>
+            </w:r>
+          </w:p>
+        </w:tc>
+        <w:tc>
+          <w:tcPr>
+            <w:tcW w:type="dxa" w:w="2551"/>
+          </w:tcPr>
+          <w:p>
+            <w:pPr>
+              <w:jc w:val="center"/>
+            </w:pPr>
+            <w:r>
+              <w:rPr>
+                <w:rFonts w:ascii="Times New Roman" w:hAnsi="Times New Roman" w:eastAsia="Times New Roman"/>
+                <w:b w:val="0"/>
+                <w:i w:val="0"/>
+                <w:sz w:val="24"/>
+              </w:rPr>
+              <w:t>260.712.000</w:t>
+            </w:r>
+          </w:p>
+        </w:tc>
+      </w:tr>
+      <w:tr>
+        <w:trPr>
+          <w:cantSplit/>
+        </w:trPr>
+        <w:tc>
+          <w:tcPr>
+            <w:tcW w:type="dxa" w:w="6236"/>
+          </w:tcPr>
+          <w:p>
+            <w:pPr>
+              <w:jc w:val="left"/>
+            </w:pPr>
+            <w:r>
+              <w:rPr>
+                <w:rFonts w:ascii="Times New Roman" w:hAnsi="Times New Roman" w:eastAsia="Times New Roman"/>
+                <w:b w:val="0"/>
+                <w:i w:val="0"/>
+                <w:sz w:val="24"/>
+              </w:rPr>
+              <w:t>Giá trị bổ sung theo Phụ lục (đã gồm VAT 8%)</w:t>
+            </w:r>
+          </w:p>
+        </w:tc>
+        <w:tc>
+          <w:tcPr>
+            <w:tcW w:type="dxa" w:w="2551"/>
+          </w:tcPr>
+          <w:p>
+            <w:pPr>
+              <w:jc w:val="center"/>
+            </w:pPr>
+            <w:r>
+              <w:rPr>
+                <w:rFonts w:ascii="Times New Roman" w:hAnsi="Times New Roman" w:eastAsia="Times New Roman"/>
+                <w:b w:val="0"/>
+                <w:i w:val="0"/>
+                <w:sz w:val="24"/>
+              </w:rPr>
+              <w:t>30.456.000</w:t>
+            </w:r>
+          </w:p>
+        </w:tc>
+      </w:tr>
+      <w:tr>
+        <w:trPr>
+          <w:cantSplit/>
+        </w:trPr>
+        <w:tc>
+          <w:tcPr>
+            <w:tcW w:type="dxa" w:w="6236"/>
+          </w:tcPr>
+          <w:p>
+            <w:pPr>
+              <w:jc w:val="left"/>
+            </w:pPr>
+            <w:r>
+              <w:rPr>
+                <w:rFonts w:ascii="Times New Roman" w:hAnsi="Times New Roman" w:eastAsia="Times New Roman"/>
                 <w:b/>
                 <w:i w:val="0"/>
                 <w:sz w:val="24"/>
               </w:rPr>
-              <w:t>Tổng giá trị Hợp đồng sau bổ sung (đã gồm VAT 8%)</w:t>
+              <w:t>Tổng giá trị Hợp đồng sau bổ sung</w:t>
             </w:r>
           </w:p>
         </w:tc>
@@ -418,22 +490,8 @@
     </w:tbl>
     <w:p>
       <w:pPr>
-        <w:spacing w:after="40"/>
+        <w:spacing w:after="0" w:line="120" w:lineRule="exact"/>
       </w:pPr>
-    </w:p>
-    <w:p>
-      <w:pPr>
-        <w:spacing w:after="60"/>
-        <w:jc w:val="both"/>
-      </w:pPr>
-      <w:r>
-        <w:rPr>
-          <w:rFonts w:ascii="Times New Roman" w:hAnsi="Times New Roman" w:eastAsia="Times New Roman"/>
-          <w:b w:val="0"/>
-          <w:i w:val="0"/>
-        </w:rPr>
-        <w:t>Trong đó: 130.356.000 đồng là 50% giá trị còn lại của Hợp đồng gốc và 30.456.000 đồng là giá trị bổ sung theo Phụ lục (đã gồm VAT 8%).</w:t>
-      </w:r>
     </w:p>
     <w:p>
       <w:pPr>
@@ -451,7 +509,8 @@
     </w:p>
     <w:p>
       <w:pPr>
-        <w:spacing w:after="60"/>
+        <w:keepNext/>
+        <w:spacing w:after="80"/>
         <w:jc w:val="both"/>
       </w:pPr>
       <w:r>
@@ -460,170 +519,146 @@
           <w:b w:val="0"/>
           <w:i w:val="0"/>
         </w:rPr>
-        <w:t>Thời hạn thanh toán: Theo Điều 2 của Hợp đồng và Phụ lục hợp đồng.</w:t>
+        <w:t>Thời hạn thanh toán: theo Điều 2 của Hợp đồng và Phụ lục hợp đồng. Kính đề nghị Quý Công ty chuyển khoản cho CÔNG TY TNHH THƯƠNG MẠI VÀ CÔNG NGHIỆP TRUNG KIÊN, số tài khoản 1040801350 tại Ngân hàng TMCP Ngoại thương Việt Nam (Vietcombank) – CN Hà Nội – PGD số 2; nội dung: Thanh toán phần còn lại hợp đồng HĐKT102026-TK-H. Trân trọng cảm ơn Quý Công ty!</w:t>
       </w:r>
     </w:p>
+    <w:tbl>
+      <w:tblPr>
+        <w:tblW w:type="auto" w:w="0"/>
+        <w:tblLayout w:type="fixed"/>
+        <w:tblLook w:firstColumn="1" w:firstRow="1" w:lastColumn="0" w:lastRow="0" w:noHBand="0" w:noVBand="1" w:val="04A0"/>
+        <w:tblBorders>
+          <w:top w:val="nil" w:sz="4" w:color="000000"/>
+          <w:left w:val="nil" w:sz="4" w:color="000000"/>
+          <w:bottom w:val="nil" w:sz="4" w:color="000000"/>
+          <w:right w:val="nil" w:sz="4" w:color="000000"/>
+          <w:insideH w:val="nil" w:sz="4" w:color="000000"/>
+          <w:insideV w:val="nil" w:sz="4" w:color="000000"/>
+        </w:tblBorders>
+        <w:tblLayout w:type="fixed"/>
+      </w:tblPr>
+      <w:tblGrid>
+        <w:gridCol w:w="4592"/>
+        <w:gridCol w:w="4592"/>
+      </w:tblGrid>
+      <w:tr>
+        <w:trPr>
+          <w:cantSplit/>
+        </w:trPr>
+        <w:tc>
+          <w:tcPr>
+            <w:tcW w:type="dxa" w:w="4592"/>
+          </w:tcPr>
+          <w:p>
+            <w:pPr>
+              <w:keepNext/>
+              <w:jc w:val="center"/>
+            </w:pPr>
+            <w:r>
+              <w:rPr>
+                <w:rFonts w:ascii="Times New Roman" w:hAnsi="Times New Roman" w:eastAsia="Times New Roman"/>
+                <w:b/>
+                <w:i w:val="0"/>
+              </w:rPr>
+            </w:r>
+          </w:p>
+          <w:p>
+            <w:pPr>
+              <w:keepNext/>
+              <w:jc w:val="center"/>
+            </w:pPr>
+            <w:r>
+              <w:rPr>
+                <w:rFonts w:ascii="Times New Roman" w:hAnsi="Times New Roman" w:eastAsia="Times New Roman"/>
+                <w:b w:val="0"/>
+                <w:i/>
+                <w:sz w:val="24"/>
+              </w:rPr>
+            </w:r>
+          </w:p>
+          <w:p>
+            <w:pPr>
+              <w:keepNext/>
+            </w:pPr>
+          </w:p>
+          <w:p>
+            <w:pPr>
+              <w:keepNext/>
+            </w:pPr>
+          </w:p>
+          <w:p/>
+        </w:tc>
+        <w:tc>
+          <w:tcPr>
+            <w:tcW w:type="dxa" w:w="4592"/>
+          </w:tcPr>
+          <w:p>
+            <w:pPr>
+              <w:keepNext/>
+              <w:jc w:val="center"/>
+            </w:pPr>
+            <w:r>
+              <w:rPr>
+                <w:rFonts w:ascii="Times New Roman" w:hAnsi="Times New Roman" w:eastAsia="Times New Roman"/>
+                <w:b/>
+                <w:i w:val="0"/>
+              </w:rPr>
+              <w:t>BÊN ĐỀ NGHỊ THANH TOÁN</w:t>
+            </w:r>
+          </w:p>
+          <w:p>
+            <w:pPr>
+              <w:keepNext/>
+              <w:jc w:val="center"/>
+            </w:pPr>
+            <w:r>
+              <w:rPr>
+                <w:rFonts w:ascii="Times New Roman" w:hAnsi="Times New Roman" w:eastAsia="Times New Roman"/>
+                <w:b w:val="0"/>
+                <w:i/>
+                <w:sz w:val="24"/>
+              </w:rPr>
+            </w:r>
+          </w:p>
+          <w:p>
+            <w:pPr>
+              <w:keepNext/>
+            </w:pPr>
+          </w:p>
+          <w:p>
+            <w:pPr>
+              <w:keepNext/>
+            </w:pPr>
+          </w:p>
+          <w:p>
+            <w:pPr>
+              <w:keepNext/>
+            </w:pPr>
+          </w:p>
+          <w:p>
+            <w:pPr>
+              <w:jc w:val="center"/>
+            </w:pPr>
+            <w:r>
+              <w:rPr>
+                <w:rFonts w:ascii="Times New Roman" w:hAnsi="Times New Roman" w:eastAsia="Times New Roman"/>
+                <w:b/>
+                <w:i w:val="0"/>
+              </w:rPr>
+              <w:t>Nguyễn Việt Trung</w:t>
+            </w:r>
+          </w:p>
+        </w:tc>
+      </w:tr>
+    </w:tbl>
     <w:p>
       <w:pPr>
-        <w:spacing w:after="40"/>
-        <w:jc w:val="both"/>
+        <w:spacing w:after="0" w:line="120" w:lineRule="exact"/>
       </w:pPr>
-      <w:r>
-        <w:rPr>
-          <w:rFonts w:ascii="Times New Roman" w:hAnsi="Times New Roman" w:eastAsia="Times New Roman"/>
-          <w:b w:val="0"/>
-          <w:i w:val="0"/>
-        </w:rPr>
-        <w:t>Kính đề nghị Quý Công ty chuyển khoản theo thông tin sau:</w:t>
-      </w:r>
-    </w:p>
-    <w:p>
-      <w:pPr>
-        <w:spacing w:after="0"/>
-        <w:jc w:val="both"/>
-      </w:pPr>
-      <w:r>
-        <w:rPr>
-          <w:rFonts w:ascii="Times New Roman" w:hAnsi="Times New Roman" w:eastAsia="Times New Roman"/>
-          <w:b w:val="0"/>
-          <w:i w:val="0"/>
-        </w:rPr>
-        <w:t>Đơn vị thụ hưởng: CÔNG TY TNHH THƯƠNG MẠI VÀ CÔNG NGHIỆP TRUNG KIÊN</w:t>
-      </w:r>
-    </w:p>
-    <w:p>
-      <w:pPr>
-        <w:spacing w:after="0"/>
-        <w:jc w:val="both"/>
-      </w:pPr>
-      <w:r>
-        <w:rPr>
-          <w:rFonts w:ascii="Times New Roman" w:hAnsi="Times New Roman" w:eastAsia="Times New Roman"/>
-          <w:b w:val="0"/>
-          <w:i w:val="0"/>
-        </w:rPr>
-        <w:t>Số tài khoản: 1040801350</w:t>
-      </w:r>
-    </w:p>
-    <w:p>
-      <w:pPr>
-        <w:spacing w:after="0"/>
-        <w:jc w:val="both"/>
-      </w:pPr>
-      <w:r>
-        <w:rPr>
-          <w:rFonts w:ascii="Times New Roman" w:hAnsi="Times New Roman" w:eastAsia="Times New Roman"/>
-          <w:b w:val="0"/>
-          <w:i w:val="0"/>
-        </w:rPr>
-        <w:t>Ngân hàng: Ngân hàng TMCP Ngoại thương Việt Nam (Vietcombank) – CN Hà Nội – PGD số 2.</w:t>
-      </w:r>
-    </w:p>
-    <w:p>
-      <w:pPr>
-        <w:spacing w:after="120"/>
-        <w:jc w:val="both"/>
-      </w:pPr>
-      <w:r>
-        <w:rPr>
-          <w:rFonts w:ascii="Times New Roman" w:hAnsi="Times New Roman" w:eastAsia="Times New Roman"/>
-          <w:b w:val="0"/>
-          <w:i w:val="0"/>
-        </w:rPr>
-        <w:t>Nội dung chuyển khoản: Thanh toán phần còn lại hợp đồng HĐKT102026-TK-H.</w:t>
-      </w:r>
-    </w:p>
-    <w:p>
-      <w:pPr>
-        <w:spacing w:after="40"/>
-        <w:jc w:val="both"/>
-      </w:pPr>
-      <w:r>
-        <w:rPr>
-          <w:rFonts w:ascii="Times New Roman" w:hAnsi="Times New Roman" w:eastAsia="Times New Roman"/>
-          <w:b w:val="0"/>
-          <w:i w:val="0"/>
-        </w:rPr>
-        <w:t>Trân trọng cảm ơn Quý Công ty!</w:t>
-      </w:r>
-    </w:p>
-    <w:p>
-      <w:pPr>
-        <w:spacing w:after="0"/>
-        <w:jc w:val="right"/>
-      </w:pPr>
-      <w:r>
-        <w:rPr>
-          <w:rFonts w:ascii="Times New Roman" w:hAnsi="Times New Roman" w:eastAsia="Times New Roman"/>
-          <w:b/>
-          <w:i w:val="0"/>
-        </w:rPr>
-        <w:t>ĐẠI DIỆN BÊN ĐỀ NGHỊ THANH TOÁN</w:t>
-      </w:r>
-    </w:p>
-    <w:p>
-      <w:pPr>
-        <w:spacing w:after="0"/>
-        <w:jc w:val="right"/>
-      </w:pPr>
-      <w:r>
-        <w:rPr>
-          <w:rFonts w:ascii="Times New Roman" w:hAnsi="Times New Roman" w:eastAsia="Times New Roman"/>
-          <w:b/>
-          <w:i w:val="0"/>
-        </w:rPr>
-        <w:t>GIÁM ĐỐC</w:t>
-      </w:r>
-    </w:p>
-    <w:p>
-      <w:pPr>
-        <w:spacing w:after="0"/>
-        <w:jc w:val="right"/>
-      </w:pPr>
-      <w:r>
-        <w:rPr>
-          <w:rFonts w:ascii="Times New Roman" w:hAnsi="Times New Roman" w:eastAsia="Times New Roman"/>
-          <w:b w:val="0"/>
-          <w:i/>
-        </w:rPr>
-        <w:t>(Ký, ghi rõ họ tên và đóng dấu)</w:t>
-      </w:r>
-    </w:p>
-    <w:p>
-      <w:pPr>
-        <w:spacing w:after="0"/>
-        <w:jc w:val="both"/>
-      </w:pPr>
-    </w:p>
-    <w:p>
-      <w:pPr>
-        <w:spacing w:after="0"/>
-        <w:jc w:val="both"/>
-      </w:pPr>
-    </w:p>
-    <w:p>
-      <w:pPr>
-        <w:spacing w:after="0"/>
-        <w:jc w:val="both"/>
-      </w:pPr>
-    </w:p>
-    <w:p>
-      <w:pPr>
-        <w:spacing w:after="60"/>
-        <w:jc w:val="right"/>
-      </w:pPr>
-      <w:r>
-        <w:rPr>
-          <w:rFonts w:ascii="Times New Roman" w:hAnsi="Times New Roman" w:eastAsia="Times New Roman"/>
-          <w:b/>
-          <w:i w:val="0"/>
-        </w:rPr>
-        <w:t>Nguyễn Việt Trung</w:t>
-      </w:r>
     </w:p>
     <w:sectPr>
       <w:pgSz w:w="11906" w:h="16838"/>
-      <w:pgMar w:top="850" w:right="850" w:bottom="850" w:left="1417" w:header="720" w:footer="720" w:gutter="0"/>
+      <w:pgMar w:top="1134" w:right="1134" w:bottom="1134" w:left="1701" w:header="720" w:footer="720" w:gutter="0"/>
       <w:cols w:space="720"/>
       <w:docGrid w:linePitch="360"/>
     </w:sectPr>

</xml_diff>